<commit_message>
Redesign embedding-geometry analysis (RQ2): attribute-free + SupCon-2020 baseline
- train.py: add --cl_mode {racl,supcon,none} and a faithful in-batch SupCon
  (Khosla et al., 2020) loss; data.py: resolve BGE from a local dir / env var.
- geom_probe2.py: label-conditional geometry (silhouette, alignment/uniformity,
  kNN purity@k, hard-region split); make_geom_figs.py + run_geom_campaign.py.
- Controlled 3-variant x 3-seed full-fine-tuning study (none/SupCon/RACL); RACL
  attains the best, most stable class separation without collapsing the space.
- Rewrite paper section 4.6 + Table 6 (EN tex + ZH md/docx), regenerate PDF/DOCX,
  3-panel UMAP; drop attribute-conditioned metrics and the stale experiments fragment.

Co-authored-by: Cursor <cursoragent@cursor.com>
</commit_message>
<xml_diff>
--- a/paper/claimarc_paper_zh.docx
+++ b/paper/claimarc_paper_zh.docx
@@ -6754,16 +6754,7 @@
         <w:rPr>
           <w:rFonts w:hint="eastAsia"/>
         </w:rPr>
-        <w:t xml:space="preserve">若</w:t>
-      </w:r>
-      <w:r>
-        <w:t xml:space="preserve"> RACL </w:t>
-      </w:r>
-      <w:r>
-        <w:rPr>
-          <w:rFonts w:hint="eastAsia"/>
-        </w:rPr>
-        <w:t xml:space="preserve">确如设计所愿地发挥作用，它应当重塑检索表征，使索引中的近邻在所查属性与感知标签上保持一致——这正是</w:t>
+        <w:t xml:space="preserve">对比目标的价值应体现在它如何重塑标签几何：让感知误导样本与诚实样本在检索空间中更易分离，这正是</w:t>
       </w:r>
       <w:r>
         <w:t xml:space="preserve"> RKC </w:t>
@@ -6772,7 +6763,86 @@
         <w:rPr>
           <w:rFonts w:hint="eastAsia"/>
         </w:rPr>
-        <w:t xml:space="preserve">投票（§4.5）与免梯度检索库适配所依赖的结构。我们在测试集表征</w:t>
+        <w:t xml:space="preserve">投票（§4.5）与免梯度库写入所依赖的结构。为把这一效果与既有方法区分开，我们设置一项严格受控的对照——同一</w:t>
+      </w:r>
+      <w:r>
+        <w:t xml:space="preserve"> BGE </w:t>
+      </w:r>
+      <w:r>
+        <w:rPr>
+          <w:rFonts w:hint="eastAsia"/>
+        </w:rPr>
+        <w:t xml:space="preserve">全量微调骨干、同一分类头、同一超参数，三个变体只在对比目标上不同：</w:t>
+      </w:r>
+      <w:r>
+        <w:rPr>
+          <w:rFonts w:hint="eastAsia"/>
+          <w:b/>
+          <w:bCs/>
+        </w:rPr>
+        <w:t xml:space="preserve">无对比</w:t>
+      </w:r>
+      <w:r>
+        <w:rPr>
+          <w:rFonts w:hint="eastAsia"/>
+        </w:rPr>
+        <w:t xml:space="preserve">（仅</w:t>
+      </w:r>
+      <w:r>
+        <w:t xml:space="preserve"> </w:t>
+      </w:r>
+      <w:r>
+        <w:rPr>
+          <w:rFonts w:hint="eastAsia"/>
+        </w:rPr>
+        <w:t xml:space="preserve">BCE）、标准</w:t>
+      </w:r>
+      <w:r>
+        <w:rPr>
+          <w:rFonts w:hint="eastAsia"/>
+          <w:b/>
+          <w:bCs/>
+        </w:rPr>
+        <w:t xml:space="preserve">监督对比</w:t>
+      </w:r>
+      <w:r>
+        <w:t xml:space="preserve"> </w:t>
+      </w:r>
+      <w:r>
+        <w:rPr>
+          <w:rFonts w:hint="eastAsia"/>
+        </w:rPr>
+        <w:t xml:space="preserve">SupCon（Khosla</w:t>
+      </w:r>
+      <w:r>
+        <w:t xml:space="preserve"> </w:t>
+      </w:r>
+      <w:r>
+        <w:rPr>
+          <w:rFonts w:hint="eastAsia"/>
+        </w:rPr>
+        <w:t xml:space="preserve">等，2020，批内同标签互为正例、异标签为负例，无检索与困难挖掘），以及本文的</w:t>
+      </w:r>
+      <w:r>
+        <w:rPr>
+          <w:rFonts w:hint="eastAsia"/>
+          <w:b/>
+          <w:bCs/>
+        </w:rPr>
+        <w:t xml:space="preserve">检索增强对比</w:t>
+      </w:r>
+      <w:r>
+        <w:rPr>
+          <w:b/>
+          <w:bCs/>
+        </w:rPr>
+        <w:t xml:space="preserve"> RACL</w:t>
+      </w:r>
+      <w:r>
+        <w:rPr>
+          <w:rFonts w:hint="eastAsia"/>
+        </w:rPr>
+        <w:t xml:space="preserve">（全池伪金正例与困难负例，可靠性与类频加权）。所有指标均在测试集表征</w:t>
       </w:r>
       <w:r>
         <w:t xml:space="preserve"> </w:t>
@@ -6810,161 +6880,19 @@
         <w:rPr>
           <w:rFonts w:hint="eastAsia"/>
         </w:rPr>
-        <w:t xml:space="preserve">上度量两项属性条件量：到同属性</w:t>
-      </w:r>
-      <w:r>
-        <w:rPr>
-          <w:rFonts w:hint="eastAsia"/>
-          <w:b/>
-          <w:bCs/>
-        </w:rPr>
-        <w:t xml:space="preserve">同标签</w:t>
-      </w:r>
-      <w:r>
-        <w:rPr>
-          <w:rFonts w:hint="eastAsia"/>
-        </w:rPr>
-        <w:t xml:space="preserve">近邻的平均</w:t>
-      </w:r>
-      <w:r>
-        <w:t xml:space="preserve"> </w:t>
-      </w:r>
-      <w:r>
-        <w:rPr>
-          <w:rFonts w:hint="eastAsia"/>
-        </w:rPr>
-        <w:t xml:space="preserve">cosine（紧度，越高越好），以及属性条件检索质量（mAP@10，即十个最近邻共享查询属性的精度）；二者均以</w:t>
-      </w:r>
-      <w:r>
-        <w:t xml:space="preserve"> canonical </w:t>
-      </w:r>
-      <w:r>
-        <w:rPr>
-          <w:rFonts w:hint="eastAsia"/>
-        </w:rPr>
-        <w:t xml:space="preserve">对照</w:t>
-      </w:r>
-      <w:r>
-        <w:rPr>
-          <w:rFonts w:hint="eastAsia"/>
-          <w:b/>
-          <w:bCs/>
-        </w:rPr>
-        <w:t xml:space="preserve">无对比目标</w:t>
-      </w:r>
-      <w:r>
-        <w:rPr>
-          <w:rFonts w:hint="eastAsia"/>
-        </w:rPr>
-        <w:t xml:space="preserve">的同一网络，故对比是唯一差异，结果见</w:t>
-      </w:r>
-      <w:r>
-        <w:t xml:space="preserve"> Table 6。RACL </w:t>
-      </w:r>
-      <w:r>
-        <w:rPr>
-          <w:rFonts w:hint="eastAsia"/>
-        </w:rPr>
-        <w:t xml:space="preserve">把同标签紧度由</w:t>
-      </w:r>
-      <w:r>
-        <w:t xml:space="preserve"> 0.628 </w:t>
-      </w:r>
-      <w:r>
-        <w:rPr>
-          <w:rFonts w:hint="eastAsia"/>
-        </w:rPr>
-        <w:t xml:space="preserve">提升到</w:t>
-      </w:r>
-      <w:r>
-        <w:t xml:space="preserve"> </w:t>
-      </w:r>
-      <w:r>
-        <w:rPr>
-          <w:rFonts w:hint="eastAsia"/>
-        </w:rPr>
-        <w:t xml:space="preserve">0.764，把属性检索</w:t>
-      </w:r>
-      <w:r>
-        <w:t xml:space="preserve"> mAP@10 </w:t>
-      </w:r>
-      <w:r>
-        <w:rPr>
-          <w:rFonts w:hint="eastAsia"/>
-        </w:rPr>
-        <w:t xml:space="preserve">由</w:t>
-      </w:r>
-      <w:r>
-        <w:t xml:space="preserve"> 0.296 </w:t>
-      </w:r>
-      <w:r>
-        <w:rPr>
-          <w:rFonts w:hint="eastAsia"/>
-        </w:rPr>
-        <w:t xml:space="preserve">提升到</w:t>
-      </w:r>
-      <w:r>
-        <w:t xml:space="preserve"> </w:t>
-      </w:r>
-      <w:r>
-        <w:rPr>
-          <w:rFonts w:hint="eastAsia"/>
-        </w:rPr>
-        <w:t xml:space="preserve">0.325——对比把局部邻域组织得能检索出同属性、同标签样例，这正是投票所依赖的结构。Figure</w:t>
-      </w:r>
-      <w:r>
-        <w:t xml:space="preserve"> 4 </w:t>
-      </w:r>
-      <w:r>
-        <w:rPr>
-          <w:rFonts w:hint="eastAsia"/>
-        </w:rPr>
-        <w:t xml:space="preserve">的</w:t>
-      </w:r>
-      <w:r>
-        <w:t xml:space="preserve"> UMAP </w:t>
-      </w:r>
-      <w:r>
-        <w:rPr>
-          <w:rFonts w:hint="eastAsia"/>
-        </w:rPr>
-        <w:t xml:space="preserve">投影以肉眼可辨的方式佐证了标签结构：完整模型下，感知误导样本凝聚成一个分离的区域；一旦移除</w:t>
-      </w:r>
-      <w:r>
-        <w:t xml:space="preserve"> </w:t>
-      </w:r>
-      <w:r>
-        <w:rPr>
-          <w:rFonts w:hint="eastAsia"/>
-        </w:rPr>
-        <w:t xml:space="preserve">RACL，两类样本便彼此交织。这正是</w:t>
-      </w:r>
-      <w:r>
-        <w:t xml:space="preserve"> §4.4 </w:t>
-      </w:r>
-      <w:r>
-        <w:rPr>
-          <w:rFonts w:hint="eastAsia"/>
-        </w:rPr>
-        <w:t xml:space="preserve">中</w:t>
-      </w:r>
-      <w:r>
-        <w:t xml:space="preserve"> AP </w:t>
-      </w:r>
-      <w:r>
-        <w:rPr>
-          <w:rFonts w:hint="eastAsia"/>
-        </w:rPr>
-        <w:t xml:space="preserve">增益的几何对应，也解释了为何冻结编码器的投票唯有在</w:t>
-      </w:r>
-      <w:r>
-        <w:t xml:space="preserve"> RACL </w:t>
-      </w:r>
-      <w:r>
-        <w:rPr>
-          <w:rFonts w:hint="eastAsia"/>
-        </w:rPr>
-        <w:t xml:space="preserve">之后才奏效（§4.5）。</w:t>
+        <w:t xml:space="preserve">上以</w:t>
+      </w:r>
+      <w:r>
+        <w:t xml:space="preserve"> 3 </w:t>
+      </w:r>
+      <w:r>
+        <w:rPr>
+          <w:rFonts w:hint="eastAsia"/>
+        </w:rPr>
+        <w:t xml:space="preserve">个随机种子度量、且与属性无关（训练集作检索索引、测试集作查询），结果见</w:t>
+      </w:r>
+      <w:r>
+        <w:t xml:space="preserve"> Table 6。</w:t>
       </w:r>
     </w:p>
     <w:p>
@@ -6973,28 +6901,373 @@
       </w:pPr>
       <w:r>
         <w:rPr>
+          <w:rFonts w:hint="eastAsia"/>
+        </w:rPr>
+        <w:t xml:space="preserve">可得三点结论。其一，</w:t>
+      </w:r>
+      <w:r>
+        <w:rPr>
+          <w:rFonts w:hint="eastAsia"/>
           <w:b/>
           <w:bCs/>
         </w:rPr>
+        <w:t xml:space="preserve">类可分性</w:t>
+      </w:r>
+      <w:r>
+        <w:rPr>
+          <w:rFonts w:hint="eastAsia"/>
+        </w:rPr>
+        <w:t xml:space="preserve">：RACL</w:t>
+      </w:r>
+      <w:r>
+        <w:t xml:space="preserve"> </w:t>
+      </w:r>
+      <w:r>
+        <w:rPr>
+          <w:rFonts w:hint="eastAsia"/>
+        </w:rPr>
+        <w:t xml:space="preserve">的标签</w:t>
+      </w:r>
+      <w:r>
+        <w:t xml:space="preserve"> silhouette </w:t>
+      </w:r>
+      <w:r>
+        <w:rPr>
+          <w:rFonts w:hint="eastAsia"/>
+        </w:rPr>
+        <w:t xml:space="preserve">达</w:t>
+      </w:r>
+      <w:r>
+        <w:t xml:space="preserve"> </w:t>
+      </w:r>
+      <w:r>
+        <w:rPr>
+          <w:rFonts w:hint="eastAsia"/>
+        </w:rPr>
+        <w:t xml:space="preserve">0.422，高于标准</w:t>
+      </w:r>
+      <w:r>
+        <w:t xml:space="preserve"> SupCon </w:t>
+      </w:r>
+      <w:r>
+        <w:rPr>
+          <w:rFonts w:hint="eastAsia"/>
+        </w:rPr>
+        <w:t xml:space="preserve">的</w:t>
+      </w:r>
+      <w:r>
+        <w:t xml:space="preserve"> 0.349 </w:t>
+      </w:r>
+      <w:r>
+        <w:rPr>
+          <w:rFonts w:hint="eastAsia"/>
+        </w:rPr>
+        <w:t xml:space="preserve">与无对比的</w:t>
+      </w:r>
+      <w:r>
+        <w:t xml:space="preserve"> </w:t>
+      </w:r>
+      <w:r>
+        <w:rPr>
+          <w:rFonts w:hint="eastAsia"/>
+        </w:rPr>
+        <w:t xml:space="preserve">0.196，且方差最小（±0.010，对</w:t>
+      </w:r>
+      <w:r>
+        <w:t xml:space="preserve"> SupCon </w:t>
+      </w:r>
+      <w:r>
+        <w:rPr>
+          <w:rFonts w:hint="eastAsia"/>
+        </w:rPr>
+        <w:t xml:space="preserve">的</w:t>
+      </w:r>
+      <w:r>
+        <w:t xml:space="preserve"> </w:t>
+      </w:r>
+      <w:r>
+        <w:rPr>
+          <w:rFonts w:hint="eastAsia"/>
+        </w:rPr>
+        <w:t xml:space="preserve">±0.173），是三者中最稳健的类分离；Figure</w:t>
+      </w:r>
+      <w:r>
+        <w:t xml:space="preserve"> 4 </w:t>
+      </w:r>
+      <w:r>
+        <w:rPr>
+          <w:rFonts w:hint="eastAsia"/>
+        </w:rPr>
+        <w:t xml:space="preserve">的</w:t>
+      </w:r>
+      <w:r>
+        <w:t xml:space="preserve"> UMAP </w:t>
+      </w:r>
+      <w:r>
+        <w:rPr>
+          <w:rFonts w:hint="eastAsia"/>
+        </w:rPr>
+        <w:t xml:space="preserve">投影以肉眼可辨的方式印证——RACL</w:t>
+      </w:r>
+      <w:r>
+        <w:t xml:space="preserve"> </w:t>
+      </w:r>
+      <w:r>
+        <w:rPr>
+          <w:rFonts w:hint="eastAsia"/>
+        </w:rPr>
+        <w:t xml:space="preserve">把感知误导样本凝聚成一个明显分离的独立簇，无对比时两类彼此交织，标准</w:t>
+      </w:r>
+      <w:r>
+        <w:t xml:space="preserve"> SupCon </w:t>
+      </w:r>
+      <w:r>
+        <w:rPr>
+          <w:rFonts w:hint="eastAsia"/>
+        </w:rPr>
+        <w:t xml:space="preserve">居中。其二，</w:t>
+      </w:r>
+      <w:r>
+        <w:rPr>
+          <w:b/>
+          <w:bCs/>
+        </w:rPr>
+        <w:t xml:space="preserve">RACL </w:t>
+      </w:r>
+      <w:r>
+        <w:rPr>
+          <w:rFonts w:hint="eastAsia"/>
+          <w:b/>
+          <w:bCs/>
+        </w:rPr>
+        <w:t xml:space="preserve">与标准</w:t>
+      </w:r>
+      <w:r>
+        <w:rPr>
+          <w:b/>
+          <w:bCs/>
+        </w:rPr>
+        <w:t xml:space="preserve"> SupCon </w:t>
+      </w:r>
+      <w:r>
+        <w:rPr>
+          <w:rFonts w:hint="eastAsia"/>
+          <w:b/>
+          <w:bCs/>
+        </w:rPr>
+        <w:t xml:space="preserve">的关键差异在于是否塌缩表征</w:t>
+      </w:r>
+      <w:r>
+        <w:rPr>
+          <w:rFonts w:hint="eastAsia"/>
+        </w:rPr>
+        <w:t xml:space="preserve">：SupCon</w:t>
+      </w:r>
+      <w:r>
+        <w:t xml:space="preserve"> </w:t>
+      </w:r>
+      <w:r>
+        <w:rPr>
+          <w:rFonts w:hint="eastAsia"/>
+        </w:rPr>
+        <w:t xml:space="preserve">把同标签压得最紧（alignment</w:t>
+      </w:r>
+      <w:r>
+        <w:t xml:space="preserve"> </w:t>
+      </w:r>
+      <w:r>
+        <w:rPr>
+          <w:rFonts w:hint="eastAsia"/>
+        </w:rPr>
+        <w:t xml:space="preserve">0.478），却以牺牲均匀性为代价（uniformity</w:t>
+      </w:r>
+      <w:r>
+        <w:t xml:space="preserve"> </w:t>
+      </w:r>
+      <w:r>
+        <w:rPr>
+          <w:rFonts w:hint="eastAsia"/>
+        </w:rPr>
+        <w:t xml:space="preserve">仅</w:t>
+      </w:r>
+      <w:r>
+        <w:t xml:space="preserve"> </w:t>
+      </w:r>
+      <w:r>
+        <w:rPr>
+          <w:rFonts w:hint="eastAsia"/>
+        </w:rPr>
+        <w:t xml:space="preserve">−0.86），即把同类样本挤向一处；RACL</w:t>
+      </w:r>
+      <w:r>
+        <w:t xml:space="preserve"> </w:t>
+      </w:r>
+      <w:r>
+        <w:rPr>
+          <w:rFonts w:hint="eastAsia"/>
+        </w:rPr>
+        <w:t xml:space="preserve">则在保持空间展开（uniformity</w:t>
+      </w:r>
+      <w:r>
+        <w:t xml:space="preserve"> </w:t>
+      </w:r>
+      <w:r>
+        <w:rPr>
+          <w:rFonts w:hint="eastAsia"/>
+        </w:rPr>
+        <w:t xml:space="preserve">−1.21）的同时取得更佳的类分离，落在</w:t>
+      </w:r>
+      <w:r>
+        <w:t xml:space="preserve"> alignment–uniformity </w:t>
+      </w:r>
+      <w:r>
+        <w:rPr>
+          <w:rFonts w:hint="eastAsia"/>
+        </w:rPr>
+        <w:t xml:space="preserve">平面上更利于检索的折衷区，从而避免了标准监督对比的表征塌缩（Wang</w:t>
+      </w:r>
+      <w:r>
+        <w:t xml:space="preserve"> </w:t>
+      </w:r>
+      <w:r>
+        <w:rPr>
+          <w:rFonts w:hint="eastAsia"/>
+        </w:rPr>
+        <w:t xml:space="preserve">与</w:t>
+      </w:r>
+      <w:r>
+        <w:t xml:space="preserve"> </w:t>
+      </w:r>
+      <w:r>
+        <w:rPr>
+          <w:rFonts w:hint="eastAsia"/>
+        </w:rPr>
+        <w:t xml:space="preserve">Isola，2020）。其三，</w:t>
+      </w:r>
+      <w:r>
+        <w:rPr>
+          <w:rFonts w:hint="eastAsia"/>
+          <w:b/>
+          <w:bCs/>
+        </w:rPr>
+        <w:t xml:space="preserve">困难区</w:t>
+      </w:r>
+      <w:r>
+        <w:rPr>
+          <w:rFonts w:hint="eastAsia"/>
+        </w:rPr>
+        <w:t xml:space="preserve">：把度量限制到”异标签最近邻最相似”的易混子集后，两种对比目标都把近邻纯度由</w:t>
+      </w:r>
+      <w:r>
+        <w:t xml:space="preserve"> 0.50 </w:t>
+      </w:r>
+      <w:r>
+        <w:rPr>
+          <w:rFonts w:hint="eastAsia"/>
+        </w:rPr>
+        <w:t xml:space="preserve">提升到</w:t>
+      </w:r>
+      <w:r>
+        <w:t xml:space="preserve"> </w:t>
+      </w:r>
+      <w:r>
+        <w:rPr>
+          <w:rFonts w:hint="eastAsia"/>
+        </w:rPr>
+        <w:t xml:space="preserve">0.57，说明对比信号正作用于”语义相近却标签相反”的样本——这正是</w:t>
+      </w:r>
+      <w:r>
+        <w:t xml:space="preserve"> RACL </w:t>
+      </w:r>
+      <w:r>
+        <w:rPr>
+          <w:rFonts w:hint="eastAsia"/>
+        </w:rPr>
+        <w:t xml:space="preserve">以困难负例显式施压之处。需要说明的是，标签邻域纯度@10</w:t>
+      </w:r>
+      <w:r>
+        <w:t xml:space="preserve"> </w:t>
+      </w:r>
+      <w:r>
+        <w:rPr>
+          <w:rFonts w:hint="eastAsia"/>
+        </w:rPr>
+        <w:t xml:space="preserve">在三者间基本持平（约</w:t>
+      </w:r>
+      <w:r>
+        <w:t xml:space="preserve"> </w:t>
+      </w:r>
+      <w:r>
+        <w:rPr>
+          <w:rFonts w:hint="eastAsia"/>
+        </w:rPr>
+        <w:t xml:space="preserve">0.81）：BGE</w:t>
+      </w:r>
+      <w:r>
+        <w:t xml:space="preserve"> </w:t>
+      </w:r>
+      <w:r>
+        <w:rPr>
+          <w:rFonts w:hint="eastAsia"/>
+        </w:rPr>
+        <w:t xml:space="preserve">全量微调本身已把标签一致的邻域结构建立起来，对比目标的独立贡献在于</w:t>
+      </w:r>
+      <w:r>
+        <w:rPr>
+          <w:rFonts w:hint="eastAsia"/>
+          <w:b/>
+          <w:bCs/>
+        </w:rPr>
+        <w:t xml:space="preserve">类分离而非邻域纯度</w:t>
+      </w:r>
+      <w:r>
+        <w:rPr>
+          <w:rFonts w:hint="eastAsia"/>
+        </w:rPr>
+        <w:t xml:space="preserve">。综合而言，对比训练塑造出更易分离、且未塌缩的检索几何，这正是检索投票与库写入式适配所依赖的结构，也呼应了</w:t>
+      </w:r>
+      <w:r>
+        <w:t xml:space="preserve"> §4.5 </w:t>
+      </w:r>
+      <w:r>
+        <w:rPr>
+          <w:rFonts w:hint="eastAsia"/>
+        </w:rPr>
+        <w:t xml:space="preserve">中检索投票唯有在表征经对比重塑后方能奏效。</w:t>
+      </w:r>
+    </w:p>
+    <w:p>
+      <w:pPr>
+        <w:pStyle w:val="BodyText"/>
+      </w:pPr>
+      <w:r>
+        <w:rPr>
+          <w:b/>
+          <w:bCs/>
+        </w:rPr>
         <w:t xml:space="preserve">Table 6.</w:t>
       </w:r>
       <w:r>
         <w:t xml:space="preserve"> </w:t>
       </w:r>
       <w:r>
-        <w:t xml:space="preserve">Attribute-conditioned geometry on the test set (new canonical, single seed). The class-balanced retrieval-augmented contrast tightens same-label neighborhoods and improves attribute-conditioned retrieval quality (mAP@10) relative to the same model trained without the contrastive objective.</w:t>
+        <w:t xml:space="preserve">Label-conditional geometry of the test retrieval embedding under three contrastive objectives sharing an identical BGE-full-fine-tuning backbone, classifier and hyper-parameters (3-seed mean±s.d.; metrics are attribute-free, with the train split as the retrieval index). RACL attains the best and most stable label silhouette; standard SupCon reaches the tightest alignment but at the cost of a collapsed (least uniform) space, whereas RACL preserves uniformity while separating the classes. Neighborhood purity@10 is already established by full fine-tuning and is comparable across objectives.</w:t>
       </w:r>
     </w:p>
     <w:tbl>
       <w:tblPr>
         <w:tblStyle w:val="Table"/>
-        <w:tblW w:type="auto" w:w="0"/>
+        <w:tblW w:type="pct" w:w="5000"/>
+        <w:tblLayout w:type="fixed"/>
         <w:tblLook w:firstRow="1" w:lastRow="0" w:firstColumn="0" w:lastColumn="0" w:noHBand="0" w:noVBand="0" w:val="0020"/>
       </w:tblPr>
       <w:tblGrid>
-        <w:gridCol w:w="2640"/>
-        <w:gridCol w:w="2640"/>
-        <w:gridCol w:w="2640"/>
+        <w:gridCol w:w="1033"/>
+        <w:gridCol w:w="1377"/>
+        <w:gridCol w:w="1377"/>
+        <w:gridCol w:w="1377"/>
+        <w:gridCol w:w="1377"/>
+        <w:gridCol w:w="1377"/>
       </w:tblGrid>
       <w:tr>
         <w:trPr>
@@ -7019,19 +7292,55 @@
               <w:jc w:val="right"/>
             </w:pPr>
             <w:r>
-              <w:t xml:space="preserve">Same-label tight ↑</w:t>
-            </w:r>
-          </w:p>
-        </w:tc>
-        <w:tc>
-          <w:tcPr/>
-          <w:p>
-            <w:pPr>
-              <w:pStyle w:val="Compact"/>
-              <w:jc w:val="right"/>
-            </w:pPr>
-            <w:r>
-              <w:t xml:space="preserve">Attr. mAP@10 ↑</w:t>
+              <w:t xml:space="preserve">Silhouette ↑</w:t>
+            </w:r>
+          </w:p>
+        </w:tc>
+        <w:tc>
+          <w:tcPr/>
+          <w:p>
+            <w:pPr>
+              <w:pStyle w:val="Compact"/>
+              <w:jc w:val="right"/>
+            </w:pPr>
+            <w:r>
+              <w:t xml:space="preserve">Hard-region purity@10 ↑</w:t>
+            </w:r>
+          </w:p>
+        </w:tc>
+        <w:tc>
+          <w:tcPr/>
+          <w:p>
+            <w:pPr>
+              <w:pStyle w:val="Compact"/>
+              <w:jc w:val="right"/>
+            </w:pPr>
+            <w:r>
+              <w:t xml:space="preserve">Alignment ↓</w:t>
+            </w:r>
+          </w:p>
+        </w:tc>
+        <w:tc>
+          <w:tcPr/>
+          <w:p>
+            <w:pPr>
+              <w:pStyle w:val="Compact"/>
+              <w:jc w:val="right"/>
+            </w:pPr>
+            <w:r>
+              <w:t xml:space="preserve">Uniformity</w:t>
+            </w:r>
+          </w:p>
+        </w:tc>
+        <w:tc>
+          <w:tcPr/>
+          <w:p>
+            <w:pPr>
+              <w:pStyle w:val="Compact"/>
+              <w:jc w:val="right"/>
+            </w:pPr>
+            <w:r>
+              <w:t xml:space="preserve">kNN purity@10</w:t>
             </w:r>
           </w:p>
         </w:tc>
@@ -7044,31 +7353,67 @@
               <w:pStyle w:val="Compact"/>
             </w:pPr>
             <w:r>
-              <w:t xml:space="preserve">CLAIMARC w/o RACL</w:t>
-            </w:r>
-          </w:p>
-        </w:tc>
-        <w:tc>
-          <w:tcPr/>
-          <w:p>
-            <w:pPr>
-              <w:pStyle w:val="Compact"/>
-              <w:jc w:val="right"/>
-            </w:pPr>
-            <w:r>
-              <w:t xml:space="preserve">0.628</w:t>
-            </w:r>
-          </w:p>
-        </w:tc>
-        <w:tc>
-          <w:tcPr/>
-          <w:p>
-            <w:pPr>
-              <w:pStyle w:val="Compact"/>
-              <w:jc w:val="right"/>
-            </w:pPr>
-            <w:r>
-              <w:t xml:space="preserve">0.296</w:t>
+              <w:t xml:space="preserve">w/o contrast</w:t>
+            </w:r>
+          </w:p>
+        </w:tc>
+        <w:tc>
+          <w:tcPr/>
+          <w:p>
+            <w:pPr>
+              <w:pStyle w:val="Compact"/>
+              <w:jc w:val="right"/>
+            </w:pPr>
+            <w:r>
+              <w:t xml:space="preserve">0.196±0.053</w:t>
+            </w:r>
+          </w:p>
+        </w:tc>
+        <w:tc>
+          <w:tcPr/>
+          <w:p>
+            <w:pPr>
+              <w:pStyle w:val="Compact"/>
+              <w:jc w:val="right"/>
+            </w:pPr>
+            <w:r>
+              <w:t xml:space="preserve">0.500±0.043</w:t>
+            </w:r>
+          </w:p>
+        </w:tc>
+        <w:tc>
+          <w:tcPr/>
+          <w:p>
+            <w:pPr>
+              <w:pStyle w:val="Compact"/>
+              <w:jc w:val="right"/>
+            </w:pPr>
+            <w:r>
+              <w:t xml:space="preserve">1.121</w:t>
+            </w:r>
+          </w:p>
+        </w:tc>
+        <w:tc>
+          <w:tcPr/>
+          <w:p>
+            <w:pPr>
+              <w:pStyle w:val="Compact"/>
+              <w:jc w:val="right"/>
+            </w:pPr>
+            <w:r>
+              <w:t xml:space="preserve">−2.02</w:t>
+            </w:r>
+          </w:p>
+        </w:tc>
+        <w:tc>
+          <w:tcPr/>
+          <w:p>
+            <w:pPr>
+              <w:pStyle w:val="Compact"/>
+              <w:jc w:val="right"/>
+            </w:pPr>
+            <w:r>
+              <w:t xml:space="preserve">0.811</w:t>
             </w:r>
           </w:p>
         </w:tc>
@@ -7079,29 +7424,90 @@
           <w:p>
             <w:pPr>
               <w:pStyle w:val="Compact"/>
+            </w:pPr>
+            <w:r>
+              <w:t xml:space="preserve">SupCon (Khosla et al., 2020)</w:t>
+            </w:r>
+          </w:p>
+        </w:tc>
+        <w:tc>
+          <w:tcPr/>
+          <w:p>
+            <w:pPr>
+              <w:pStyle w:val="Compact"/>
+              <w:jc w:val="right"/>
+            </w:pPr>
+            <w:r>
+              <w:t xml:space="preserve">0.349±0.173</w:t>
+            </w:r>
+          </w:p>
+        </w:tc>
+        <w:tc>
+          <w:tcPr/>
+          <w:p>
+            <w:pPr>
+              <w:pStyle w:val="Compact"/>
+              <w:jc w:val="right"/>
             </w:pPr>
             <w:r>
               <w:rPr>
                 <w:b/>
                 <w:bCs/>
               </w:rPr>
-              <w:t xml:space="preserve">CLAIMARC (full)</w:t>
-            </w:r>
-          </w:p>
-        </w:tc>
-        <w:tc>
-          <w:tcPr/>
-          <w:p>
-            <w:pPr>
-              <w:pStyle w:val="Compact"/>
-              <w:jc w:val="right"/>
+              <w:t xml:space="preserve">0.573±0.017</w:t>
+            </w:r>
+          </w:p>
+        </w:tc>
+        <w:tc>
+          <w:tcPr/>
+          <w:p>
+            <w:pPr>
+              <w:pStyle w:val="Compact"/>
+              <w:jc w:val="right"/>
+            </w:pPr>
+            <w:r>
+              <w:t xml:space="preserve">0.478</w:t>
+            </w:r>
+          </w:p>
+        </w:tc>
+        <w:tc>
+          <w:tcPr/>
+          <w:p>
+            <w:pPr>
+              <w:pStyle w:val="Compact"/>
+              <w:jc w:val="right"/>
+            </w:pPr>
+            <w:r>
+              <w:t xml:space="preserve">−0.86</w:t>
+            </w:r>
+          </w:p>
+        </w:tc>
+        <w:tc>
+          <w:tcPr/>
+          <w:p>
+            <w:pPr>
+              <w:pStyle w:val="Compact"/>
+              <w:jc w:val="right"/>
+            </w:pPr>
+            <w:r>
+              <w:t xml:space="preserve">0.804</w:t>
+            </w:r>
+          </w:p>
+        </w:tc>
+      </w:tr>
+      <w:tr>
+        <w:tc>
+          <w:tcPr/>
+          <w:p>
+            <w:pPr>
+              <w:pStyle w:val="Compact"/>
             </w:pPr>
             <w:r>
               <w:rPr>
                 <w:b/>
                 <w:bCs/>
               </w:rPr>
-              <w:t xml:space="preserve">0.764</w:t>
+              <w:t xml:space="preserve">RACL (ours)</w:t>
             </w:r>
           </w:p>
         </w:tc>
@@ -7117,7 +7523,59 @@
                 <w:b/>
                 <w:bCs/>
               </w:rPr>
-              <w:t xml:space="preserve">0.325</w:t>
+              <w:t xml:space="preserve">0.422±0.010</w:t>
+            </w:r>
+          </w:p>
+        </w:tc>
+        <w:tc>
+          <w:tcPr/>
+          <w:p>
+            <w:pPr>
+              <w:pStyle w:val="Compact"/>
+              <w:jc w:val="right"/>
+            </w:pPr>
+            <w:r>
+              <w:rPr>
+                <w:b/>
+                <w:bCs/>
+              </w:rPr>
+              <w:t xml:space="preserve">0.573±0.088</w:t>
+            </w:r>
+          </w:p>
+        </w:tc>
+        <w:tc>
+          <w:tcPr/>
+          <w:p>
+            <w:pPr>
+              <w:pStyle w:val="Compact"/>
+              <w:jc w:val="right"/>
+            </w:pPr>
+            <w:r>
+              <w:t xml:space="preserve">0.905</w:t>
+            </w:r>
+          </w:p>
+        </w:tc>
+        <w:tc>
+          <w:tcPr/>
+          <w:p>
+            <w:pPr>
+              <w:pStyle w:val="Compact"/>
+              <w:jc w:val="right"/>
+            </w:pPr>
+            <w:r>
+              <w:t xml:space="preserve">−1.21</w:t>
+            </w:r>
+          </w:p>
+        </w:tc>
+        <w:tc>
+          <w:tcPr/>
+          <w:p>
+            <w:pPr>
+              <w:pStyle w:val="Compact"/>
+              <w:jc w:val="right"/>
+            </w:pPr>
+            <w:r>
+              <w:t xml:space="preserve">0.811</w:t>
             </w:r>
           </w:p>
         </w:tc>
@@ -7130,9 +7588,9 @@
       <w:r>
         <w:drawing>
           <wp:inline>
-            <wp:extent cx="5334000" cy="1917356"/>
+            <wp:extent cx="5334000" cy="2009078"/>
             <wp:effectExtent b="0" l="0" r="0" t="0"/>
-            <wp:docPr descr="Figure 4. UMAP of the retrieval embedding \mathbf{g}_{p,a} (test), colored by perceived-risk label. The full model (left) isolates the misleading pairs into a detached cluster; removing RACL (middle) collapses the separation." title="" id="24" name="Picture"/>
+            <wp:docPr descr="Figure 4. UMAP of the test retrieval embedding \mathbf{g}_{p,a}, colored by perceived-risk label, under the three contrastive objectives (w/o contrast | SupCon 2020 | RACL). RACL isolates the misleading pairs into a detached cluster; without contrast the two classes interleave, while standard SupCon lies in between." title="" id="24" name="Picture"/>
             <a:graphic>
               <a:graphicData uri="http://schemas.openxmlformats.org/drawingml/2006/picture">
                 <pic:pic>
@@ -7151,7 +7609,7 @@
                   <pic:spPr bwMode="auto">
                     <a:xfrm>
                       <a:off x="0" y="0"/>
-                      <a:ext cx="5334000" cy="1917356"/>
+                      <a:ext cx="5334000" cy="2009078"/>
                     </a:xfrm>
                     <a:prstGeom prst="rect">
                       <a:avLst/>
@@ -7175,7 +7633,7 @@
         <w:pStyle w:val="ImageCaption"/>
       </w:pPr>
       <w:r>
-        <w:t xml:space="preserve">Figure 4. UMAP of the retrieval embedding</w:t>
+        <w:t xml:space="preserve">Figure 4. UMAP of the test retrieval embedding</w:t>
       </w:r>
       <w:r>
         <w:t xml:space="preserve"> </w:t>
@@ -7207,10 +7665,7 @@
         </m:sSub>
       </m:oMath>
       <w:r>
-        <w:t xml:space="preserve"> </w:t>
-      </w:r>
-      <w:r>
-        <w:t xml:space="preserve">(test), colored by perceived-risk label. The full model (left) isolates the misleading pairs into a detached cluster; removing RACL (middle) collapses the separation.</w:t>
+        <w:t xml:space="preserve">, colored by perceived-risk label, under the three contrastive objectives (w/o contrast | SupCon 2020 | RACL). RACL isolates the misleading pairs into a detached cluster; without contrast the two classes interleave, while standard SupCon lies in between.</w:t>
       </w:r>
     </w:p>
     <w:bookmarkEnd w:id="26"/>
@@ -12449,19 +12904,64 @@
         <w:rPr>
           <w:rFonts w:hint="eastAsia"/>
         </w:rPr>
-        <w:t xml:space="preserve">而言，RACL</w:t>
-      </w:r>
-      <w:r>
-        <w:t xml:space="preserve"> </w:t>
-      </w:r>
-      <w:r>
-        <w:rPr>
-          <w:rFonts w:hint="eastAsia"/>
-        </w:rPr>
-        <w:t xml:space="preserve">塑造出预期的几何，把同属性同标签紧度由</w:t>
-      </w:r>
-      <w:r>
-        <w:t xml:space="preserve"> 0.628 </w:t>
+        <w:t xml:space="preserve">而言，在与标准监督对比（SupCon；Khosla</w:t>
+      </w:r>
+      <w:r>
+        <w:t xml:space="preserve"> </w:t>
+      </w:r>
+      <w:r>
+        <w:rPr>
+          <w:rFonts w:hint="eastAsia"/>
+        </w:rPr>
+        <w:t xml:space="preserve">等，2020）的受控对照下，RACL</w:t>
+      </w:r>
+      <w:r>
+        <w:t xml:space="preserve"> </w:t>
+      </w:r>
+      <w:r>
+        <w:rPr>
+          <w:rFonts w:hint="eastAsia"/>
+        </w:rPr>
+        <w:t xml:space="preserve">取得三者中最佳且最稳健的类可分性（标签</w:t>
+      </w:r>
+      <w:r>
+        <w:t xml:space="preserve"> silhouette </w:t>
+      </w:r>
+      <w:r>
+        <w:rPr>
+          <w:rFonts w:hint="eastAsia"/>
+        </w:rPr>
+        <w:t xml:space="preserve">0.422，高于</w:t>
+      </w:r>
+      <w:r>
+        <w:t xml:space="preserve"> SupCon </w:t>
+      </w:r>
+      <w:r>
+        <w:rPr>
+          <w:rFonts w:hint="eastAsia"/>
+        </w:rPr>
+        <w:t xml:space="preserve">的</w:t>
+      </w:r>
+      <w:r>
+        <w:t xml:space="preserve"> 0.349 </w:t>
+      </w:r>
+      <w:r>
+        <w:rPr>
+          <w:rFonts w:hint="eastAsia"/>
+        </w:rPr>
+        <w:t xml:space="preserve">与无对比的</w:t>
+      </w:r>
+      <w:r>
+        <w:t xml:space="preserve"> </w:t>
+      </w:r>
+      <w:r>
+        <w:rPr>
+          <w:rFonts w:hint="eastAsia"/>
+        </w:rPr>
+        <w:t xml:space="preserve">0.196），并把困难区近邻纯度由</w:t>
+      </w:r>
+      <w:r>
+        <w:t xml:space="preserve"> 0.50 </w:t>
       </w:r>
       <w:r>
         <w:rPr>
@@ -12476,25 +12976,25 @@
         <w:rPr>
           <w:rFonts w:hint="eastAsia"/>
         </w:rPr>
-        <w:t xml:space="preserve">0.764、把属性条件检索质量（mAP@10）由</w:t>
-      </w:r>
-      <w:r>
-        <w:t xml:space="preserve"> 0.296 </w:t>
-      </w:r>
-      <w:r>
-        <w:rPr>
-          <w:rFonts w:hint="eastAsia"/>
-        </w:rPr>
-        <w:t xml:space="preserve">提升到</w:t>
-      </w:r>
-      <w:r>
-        <w:t xml:space="preserve"> </w:t>
-      </w:r>
-      <w:r>
-        <w:rPr>
-          <w:rFonts w:hint="eastAsia"/>
-        </w:rPr>
-        <w:t xml:space="preserve">0.325，这正是检索投票与库适配所依赖的结构。就</w:t>
+        <w:t xml:space="preserve">0.57；与标准</w:t>
+      </w:r>
+      <w:r>
+        <w:t xml:space="preserve"> SupCon </w:t>
+      </w:r>
+      <w:r>
+        <w:rPr>
+          <w:rFonts w:hint="eastAsia"/>
+        </w:rPr>
+        <w:t xml:space="preserve">不同，它在分离类别的同时不塌缩表征（alignment–uniformity</w:t>
+      </w:r>
+      <w:r>
+        <w:t xml:space="preserve"> </w:t>
+      </w:r>
+      <w:r>
+        <w:rPr>
+          <w:rFonts w:hint="eastAsia"/>
+        </w:rPr>
+        <w:t xml:space="preserve">更均衡），这正是检索投票与库写入式适配所依赖的几何。就</w:t>
       </w:r>
       <w:r>
         <w:t xml:space="preserve"> RQ3 </w:t>
@@ -12827,7 +13327,7 @@
         <w:rPr>
           <w:rFonts w:hint="eastAsia"/>
         </w:rPr>
-        <w:t xml:space="preserve">把检索引导的对比学习纳入宣称–事实联合判别：在嵌入空间建索引、让近邻参与对比优化，并把学习压力集中到”语义相近却标签相反”的困难样本上；几何分析验证了这一机制收紧同标签邻域、改善属性条件检索，正是检索投票所依赖的结构。在部署层面，框架支持一个参数高效变体：训练后冻结编码器、以检索库写入完成跨域适配，把吸纳新主播、新品类与新风险话术由模型重训转化为索引维护，仅以约五个</w:t>
+        <w:t xml:space="preserve">把检索引导的对比学习纳入宣称–事实联合判别：在嵌入空间建索引、让近邻参与对比优化，并把学习压力集中到”语义相近却标签相反”的困难样本上；几何分析表明，在与标准监督对比的受控对照中，这一机制取得最佳且不塌缩的类分离，正是检索投票与库写入所依赖的结构。在部署层面，框架支持一个参数高效变体：训练后冻结编码器、以检索库写入完成跨域适配，把吸纳新主播、新品类与新风险话术由模型重训转化为索引维护，仅以约五个</w:t>
       </w:r>
       <w:r>
         <w:t xml:space="preserve"> AP </w:t>

</xml_diff>